<commit_message>
added C documents, regression processing changes
</commit_message>
<xml_diff>
--- a/MyDesign_GPTScorer Regression Test Guide.docx
+++ b/MyDesign_GPTScorer Regression Test Guide.docx
@@ -5,28 +5,20 @@
     <w:p>
       <w:pPr>
         <w:pStyle w:val="Title"/>
+        <w:jc w:val="center"/>
         <w:rPr>
           <w:b/>
           <w:bCs/>
         </w:rPr>
       </w:pPr>
-      <w:proofErr w:type="spellStart"/>
-      <w:proofErr w:type="gramStart"/>
       <w:r>
         <w:rPr>
           <w:b/>
           <w:bCs/>
         </w:rPr>
-        <w:t>MyDesign</w:t>
-      </w:r>
-      <w:proofErr w:type="gramEnd"/>
-      <w:r>
-        <w:rPr>
-          <w:b/>
-          <w:bCs/>
-        </w:rPr>
-        <w:t>_</w:t>
-      </w:r>
+        <w:t xml:space="preserve"># </w:t>
+      </w:r>
+      <w:proofErr w:type="spellStart"/>
       <w:r>
         <w:rPr>
           <w:b/>
@@ -40,148 +32,116 @@
           <w:b/>
           <w:bCs/>
         </w:rPr>
-        <w:t xml:space="preserve"> Regression Testing Guide</w:t>
-      </w:r>
-    </w:p>
-    <w:p>
-      <w:pPr>
-        <w:rPr>
-          <w:b/>
-          <w:bCs/>
-        </w:rPr>
-      </w:pPr>
-      <w:r>
-        <w:rPr>
-          <w:b/>
-          <w:bCs/>
-        </w:rPr>
-        <w:t>Overview</w:t>
-      </w:r>
-    </w:p>
-    <w:p>
-      <w:r>
-        <w:t>This tool evaluates scoring consistency across Elements A–D using precomputed GPT scores or live scoring. It compares results against baseline metrics and reports drift.</w:t>
-      </w:r>
-    </w:p>
-    <w:p>
-      <w:r>
-        <w:pict w14:anchorId="3B6E064E">
-          <v:rect id="_x0000_i1091" style="width:0;height:1.5pt" o:hralign="center" o:hrstd="t" o:hr="t" fillcolor="#a0a0a0" stroked="f"/>
-        </w:pict>
-      </w:r>
-    </w:p>
-    <w:p>
-      <w:pPr>
-        <w:rPr>
-          <w:b/>
-          <w:bCs/>
-        </w:rPr>
-      </w:pPr>
+        <w:t xml:space="preserve"> Intern Setup &amp; User Guide (Mac)</w:t>
+      </w:r>
+    </w:p>
+    <w:p/>
+    <w:p>
+      <w:r>
+        <w:t>## Overview (What This System Does Now)</w:t>
+      </w:r>
+    </w:p>
+    <w:p/>
+    <w:p>
+      <w:r>
+        <w:t xml:space="preserve">The </w:t>
+      </w:r>
+      <w:proofErr w:type="spellStart"/>
+      <w:r>
+        <w:t>GPTScorer</w:t>
+      </w:r>
+      <w:proofErr w:type="spellEnd"/>
+      <w:r>
+        <w:t xml:space="preserve"> system has evolved beyond simple regression testing. It now provides:</w:t>
+      </w:r>
+    </w:p>
+    <w:p/>
+    <w:p>
+      <w:r>
+        <w:t xml:space="preserve">- </w:t>
+      </w:r>
       <w:r>
         <w:rPr>
           <w:rFonts w:ascii="Segoe UI Emoji" w:hAnsi="Segoe UI Emoji" w:cs="Segoe UI Emoji"/>
-          <w:b/>
-          <w:bCs/>
         </w:rPr>
-        <w:t>🔁</w:t>
+        <w:t>📄</w:t>
+      </w:r>
+      <w:r>
+        <w:t xml:space="preserve"> Document scoring (Elements A–D)</w:t>
+      </w:r>
+    </w:p>
+    <w:p>
+      <w:r>
+        <w:t xml:space="preserve">- </w:t>
       </w:r>
       <w:r>
         <w:rPr>
-          <w:b/>
-          <w:bCs/>
+          <w:rFonts w:ascii="Segoe UI Emoji" w:hAnsi="Segoe UI Emoji" w:cs="Segoe UI Emoji"/>
         </w:rPr>
-        <w:t xml:space="preserve"> Standard Workflow (Recommended)</w:t>
-      </w:r>
-    </w:p>
-    <w:p>
-      <w:pPr>
+        <w:t>⚖️</w:t>
+      </w:r>
+      <w:r>
+        <w:t xml:space="preserve"> Calibration pipeline (aligns GPT scores to expert scoring behavior)</w:t>
+      </w:r>
+    </w:p>
+    <w:p>
+      <w:proofErr w:type="gramStart"/>
+      <w:r>
+        <w:t xml:space="preserve">- </w:t>
+      </w:r>
+      <w:r>
         <w:rPr>
-          <w:b/>
-          <w:bCs/>
+          <w:rFonts w:ascii="Segoe UI Emoji" w:hAnsi="Segoe UI Emoji" w:cs="Segoe UI Emoji"/>
         </w:rPr>
-      </w:pPr>
+        <w:t>📊</w:t>
+      </w:r>
+      <w:r>
+        <w:t xml:space="preserve"> Drift</w:t>
+      </w:r>
+      <w:proofErr w:type="gramEnd"/>
+      <w:r>
+        <w:t xml:space="preserve"> detection (checks if scoring behavior has changed over time)</w:t>
+      </w:r>
+    </w:p>
+    <w:p>
+      <w:proofErr w:type="gramStart"/>
+      <w:r>
+        <w:t xml:space="preserve">- </w:t>
+      </w:r>
       <w:r>
         <w:rPr>
-          <w:b/>
-          <w:bCs/>
+          <w:rFonts w:ascii="Segoe UI Emoji" w:hAnsi="Segoe UI Emoji" w:cs="Segoe UI Emoji"/>
         </w:rPr>
-        <w:t>Step 1: Clone the Repository</w:t>
-      </w:r>
-    </w:p>
-    <w:p>
-      <w:r>
-        <w:t>git clone &lt;</w:t>
-      </w:r>
-      <w:proofErr w:type="spellStart"/>
-      <w:r>
-        <w:t>bitnerme</w:t>
-      </w:r>
-      <w:proofErr w:type="spellEnd"/>
-      <w:r>
-        <w:t>/</w:t>
-      </w:r>
-      <w:proofErr w:type="spellStart"/>
-      <w:r>
-        <w:t>MyDesign_GPTScore</w:t>
-      </w:r>
-      <w:proofErr w:type="spellEnd"/>
-      <w:r>
-        <w:t>&gt;</w:t>
-      </w:r>
-    </w:p>
-    <w:p>
-      <w:r>
-        <w:t xml:space="preserve">cd </w:t>
-      </w:r>
-      <w:proofErr w:type="spellStart"/>
-      <w:r>
-        <w:t>MyDesign_GPTScore</w:t>
-      </w:r>
-      <w:proofErr w:type="spellEnd"/>
-    </w:p>
-    <w:p>
-      <w:pPr>
+        <w:t>🧪</w:t>
+      </w:r>
+      <w:r>
+        <w:t xml:space="preserve"> Regression</w:t>
+      </w:r>
+      <w:proofErr w:type="gramEnd"/>
+      <w:r>
+        <w:t xml:space="preserve"> testing (validates against "golden" datasets)</w:t>
+      </w:r>
+    </w:p>
+    <w:p>
+      <w:proofErr w:type="gramStart"/>
+      <w:r>
+        <w:t xml:space="preserve">- </w:t>
+      </w:r>
+      <w:r>
         <w:rPr>
-          <w:b/>
-          <w:bCs/>
+          <w:rFonts w:ascii="Segoe UI Emoji" w:hAnsi="Segoe UI Emoji" w:cs="Segoe UI Emoji"/>
         </w:rPr>
-      </w:pPr>
-      <w:r>
-        <w:rPr>
-          <w:b/>
-          <w:bCs/>
-        </w:rPr>
-        <w:t>Step 2: Create a Safe Working Copy</w:t>
-      </w:r>
-    </w:p>
-    <w:p>
-      <w:r>
-        <w:t xml:space="preserve">cp -r </w:t>
-      </w:r>
-      <w:proofErr w:type="spellStart"/>
-      <w:r>
-        <w:t>GPTScorer</w:t>
-      </w:r>
-      <w:proofErr w:type="spellEnd"/>
-      <w:r>
-        <w:t xml:space="preserve"> </w:t>
-      </w:r>
-      <w:proofErr w:type="spellStart"/>
-      <w:r>
-        <w:t>GPTScorer_run</w:t>
-      </w:r>
-      <w:proofErr w:type="spellEnd"/>
-    </w:p>
-    <w:p>
-      <w:r>
-        <w:t xml:space="preserve">cd </w:t>
-      </w:r>
-      <w:proofErr w:type="spellStart"/>
-      <w:r>
-        <w:t>GPTScorer_run</w:t>
-      </w:r>
-      <w:proofErr w:type="spellEnd"/>
-    </w:p>
+        <w:t>🌐</w:t>
+      </w:r>
+      <w:r>
+        <w:t xml:space="preserve"> Simple</w:t>
+      </w:r>
+      <w:proofErr w:type="gramEnd"/>
+      <w:r>
+        <w:t xml:space="preserve"> web interface (no command line needed for daily use)</w:t>
+      </w:r>
+    </w:p>
+    <w:p/>
     <w:p>
       <w:r>
         <w:rPr>
@@ -190,767 +150,1238 @@
         <w:t>👉</w:t>
       </w:r>
       <w:r>
-        <w:t xml:space="preserve"> Always run from </w:t>
+        <w:t xml:space="preserve"> Most users will ONLY use the web interface after setup.</w:t>
+      </w:r>
+    </w:p>
+    <w:p/>
+    <w:p>
+      <w:r>
+        <w:t>---</w:t>
+      </w:r>
+    </w:p>
+    <w:p/>
+    <w:p>
+      <w:r>
+        <w:t># PART 1 — One-Time Setup (Mac)</w:t>
+      </w:r>
+    </w:p>
+    <w:p/>
+    <w:p>
+      <w:r>
+        <w:t>## Step 1 — Install Required Software</w:t>
+      </w:r>
+    </w:p>
+    <w:p/>
+    <w:p>
+      <w:r>
+        <w:t>### 1. Install Python</w:t>
+      </w:r>
+    </w:p>
+    <w:p>
+      <w:r>
+        <w:t>- Go to: https://www.python.org/downloads/</w:t>
+      </w:r>
+    </w:p>
+    <w:p>
+      <w:r>
+        <w:t>- Install Python 3.10 or newer</w:t>
+      </w:r>
+    </w:p>
+    <w:p/>
+    <w:p>
+      <w:r>
+        <w:lastRenderedPageBreak/>
+        <w:t>### 2. Install Homebrew (if not already installed)</w:t>
+      </w:r>
+    </w:p>
+    <w:p>
+      <w:r>
+        <w:t>Open Terminal and paste:</w:t>
+      </w:r>
+    </w:p>
+    <w:p/>
+    <w:p>
+      <w:r>
+        <w:t>```</w:t>
+      </w:r>
+    </w:p>
+    <w:p>
+      <w:r>
+        <w:t>/bin/bash -c "$(curl -</w:t>
       </w:r>
       <w:proofErr w:type="spellStart"/>
       <w:r>
+        <w:t>fsSL</w:t>
+      </w:r>
+      <w:proofErr w:type="spellEnd"/>
+      <w:r>
+        <w:t xml:space="preserve"> https://raw.githubusercontent.com/Homebrew/install/HEAD/install.sh)"</w:t>
+      </w:r>
+    </w:p>
+    <w:p>
+      <w:r>
+        <w:t>```</w:t>
+      </w:r>
+    </w:p>
+    <w:p/>
+    <w:p>
+      <w:r>
+        <w:t>### 3. Install Tesseract (for reading PDFs/images)</w:t>
+      </w:r>
+    </w:p>
+    <w:p/>
+    <w:p>
+      <w:r>
+        <w:t>```</w:t>
+      </w:r>
+    </w:p>
+    <w:p>
+      <w:r>
+        <w:t>brew install tesseract</w:t>
+      </w:r>
+    </w:p>
+    <w:p>
+      <w:r>
+        <w:t>```</w:t>
+      </w:r>
+    </w:p>
+    <w:p/>
+    <w:p>
+      <w:r>
+        <w:t>---</w:t>
+      </w:r>
+    </w:p>
+    <w:p/>
+    <w:p>
+      <w:r>
+        <w:t>## Step 2 — Get Access to the Code (GitHub)</w:t>
+      </w:r>
+    </w:p>
+    <w:p/>
+    <w:p>
+      <w:r>
+        <w:t>You will receive a repository link from your supervisor.</w:t>
+      </w:r>
+    </w:p>
+    <w:p/>
+    <w:p>
+      <w:r>
+        <w:t>### Option A (Recommended — easiest)</w:t>
+      </w:r>
+    </w:p>
+    <w:p>
+      <w:r>
+        <w:t>1. Download ZIP from GitHub</w:t>
+      </w:r>
+    </w:p>
+    <w:p>
+      <w:r>
+        <w:t>2. Unzip it to your Desktop</w:t>
+      </w:r>
+    </w:p>
+    <w:p/>
+    <w:p>
+      <w:r>
+        <w:t>### Option B (Using Git)</w:t>
+      </w:r>
+    </w:p>
+    <w:p>
+      <w:r>
+        <w:t>If instructed to use Git:</w:t>
+      </w:r>
+    </w:p>
+    <w:p/>
+    <w:p>
+      <w:r>
+        <w:t>```</w:t>
+      </w:r>
+    </w:p>
+    <w:p>
+      <w:r>
+        <w:t>git clone &lt;REPO_URL&gt;</w:t>
+      </w:r>
+    </w:p>
+    <w:p>
+      <w:r>
+        <w:t>cd &lt;REPO_NAME&gt;</w:t>
+      </w:r>
+    </w:p>
+    <w:p>
+      <w:r>
+        <w:t>```</w:t>
+      </w:r>
+    </w:p>
+    <w:p/>
+    <w:p>
+      <w:r>
+        <w:t>---</w:t>
+      </w:r>
+    </w:p>
+    <w:p/>
+    <w:p>
+      <w:r>
+        <w:t>## Step 3 — Create a Safe Working Copy</w:t>
+      </w:r>
+    </w:p>
+    <w:p/>
+    <w:p>
+      <w:r>
+        <w:t>This prevents breaking the main system.</w:t>
+      </w:r>
+    </w:p>
+    <w:p/>
+    <w:p>
+      <w:r>
+        <w:t>```</w:t>
+      </w:r>
+    </w:p>
+    <w:p>
+      <w:r>
+        <w:t xml:space="preserve">cp -r </w:t>
+      </w:r>
+      <w:proofErr w:type="spellStart"/>
+      <w:r>
+        <w:t>GPTScorer</w:t>
+      </w:r>
+      <w:proofErr w:type="spellEnd"/>
+      <w:r>
+        <w:t xml:space="preserve"> </w:t>
+      </w:r>
+      <w:proofErr w:type="spellStart"/>
+      <w:r>
         <w:t>GPTScorer_run</w:t>
       </w:r>
       <w:proofErr w:type="spellEnd"/>
-      <w:r>
-        <w:t xml:space="preserve"> to avoid modifying the main repo.</w:t>
-      </w:r>
-    </w:p>
-    <w:p>
-      <w:r>
-        <w:pict w14:anchorId="06F4AA51">
-          <v:rect id="_x0000_i1092" style="width:0;height:1.5pt" o:hralign="center" o:hrstd="t" o:hr="t" fillcolor="#a0a0a0" stroked="f"/>
-        </w:pict>
-      </w:r>
-    </w:p>
-    <w:p>
-      <w:pPr>
-        <w:rPr>
-          <w:b/>
-          <w:bCs/>
-        </w:rPr>
-      </w:pPr>
-      <w:r>
-        <w:rPr>
-          <w:rFonts w:ascii="Segoe UI Emoji" w:hAnsi="Segoe UI Emoji" w:cs="Segoe UI Emoji"/>
-          <w:b/>
-          <w:bCs/>
-        </w:rPr>
-        <w:t>⚙️</w:t>
-      </w:r>
-      <w:r>
-        <w:rPr>
-          <w:b/>
-          <w:bCs/>
-        </w:rPr>
-        <w:t xml:space="preserve"> Environment Setup</w:t>
-      </w:r>
-    </w:p>
-    <w:p>
-      <w:pPr>
-        <w:rPr>
-          <w:b/>
-          <w:bCs/>
-        </w:rPr>
-      </w:pPr>
-      <w:r>
-        <w:rPr>
-          <w:b/>
-          <w:bCs/>
-        </w:rPr>
-        <w:t>Windows</w:t>
-      </w:r>
-    </w:p>
-    <w:p>
-      <w:r>
-        <w:t xml:space="preserve">python -m </w:t>
+    </w:p>
+    <w:p>
+      <w:r>
+        <w:t xml:space="preserve">cd </w:t>
       </w:r>
       <w:proofErr w:type="spellStart"/>
       <w:r>
-        <w:t>venv</w:t>
+        <w:t>GPTScorer_run</w:t>
       </w:r>
       <w:proofErr w:type="spellEnd"/>
-      <w:r>
-        <w:t xml:space="preserve"> </w:t>
-      </w:r>
-      <w:proofErr w:type="spellStart"/>
-      <w:r>
-        <w:t>venv</w:t>
-      </w:r>
-      <w:proofErr w:type="spellEnd"/>
-    </w:p>
-    <w:p>
-      <w:proofErr w:type="spellStart"/>
-      <w:r>
-        <w:t>venv</w:t>
-      </w:r>
-      <w:proofErr w:type="spellEnd"/>
-      <w:r>
-        <w:t>\Scripts\activate</w:t>
-      </w:r>
-    </w:p>
-    <w:p>
-      <w:r>
-        <w:t>pip install -r requirements.txt</w:t>
-      </w:r>
-    </w:p>
-    <w:p>
-      <w:pPr>
-        <w:rPr>
-          <w:b/>
-          <w:bCs/>
-        </w:rPr>
-      </w:pPr>
-      <w:r>
-        <w:rPr>
-          <w:b/>
-          <w:bCs/>
-        </w:rPr>
-        <w:t>Mac</w:t>
-      </w:r>
-    </w:p>
-    <w:p>
-      <w:r>
-        <w:t xml:space="preserve">python3 -m </w:t>
-      </w:r>
-      <w:proofErr w:type="spellStart"/>
-      <w:r>
-        <w:t>venv</w:t>
-      </w:r>
-      <w:proofErr w:type="spellEnd"/>
-      <w:r>
-        <w:t xml:space="preserve"> </w:t>
-      </w:r>
-      <w:proofErr w:type="spellStart"/>
-      <w:r>
-        <w:t>venv</w:t>
-      </w:r>
-      <w:proofErr w:type="spellEnd"/>
-    </w:p>
-    <w:p>
-      <w:r>
-        <w:t xml:space="preserve">source </w:t>
-      </w:r>
-      <w:proofErr w:type="spellStart"/>
-      <w:r>
-        <w:t>venv</w:t>
-      </w:r>
-      <w:proofErr w:type="spellEnd"/>
-      <w:r>
-        <w:t>/bin/activate</w:t>
-      </w:r>
-    </w:p>
-    <w:p>
-      <w:r>
-        <w:t>pip install -r requirements.txt</w:t>
-      </w:r>
-    </w:p>
-    <w:p>
-      <w:r>
-        <w:pict w14:anchorId="73369FF1">
-          <v:rect id="_x0000_i1093" style="width:0;height:1.5pt" o:hralign="center" o:hrstd="t" o:hr="t" fillcolor="#a0a0a0" stroked="f"/>
-        </w:pict>
-      </w:r>
-    </w:p>
-    <w:p>
-      <w:pPr>
-        <w:rPr>
-          <w:b/>
-          <w:bCs/>
-        </w:rPr>
-      </w:pPr>
-      <w:r>
-        <w:rPr>
-          <w:rFonts w:ascii="Segoe UI Emoji" w:hAnsi="Segoe UI Emoji" w:cs="Segoe UI Emoji"/>
-          <w:b/>
-          <w:bCs/>
-        </w:rPr>
-        <w:lastRenderedPageBreak/>
-        <w:t>🔍</w:t>
-      </w:r>
-      <w:r>
-        <w:rPr>
-          <w:b/>
-          <w:bCs/>
-        </w:rPr>
-        <w:t xml:space="preserve"> Mac Only: Install OCR Dependency</w:t>
-      </w:r>
-    </w:p>
-    <w:p>
-      <w:r>
-        <w:t>brew install tesseract</w:t>
-      </w:r>
-    </w:p>
-    <w:p>
-      <w:r>
-        <w:pict w14:anchorId="11A2DB70">
-          <v:rect id="_x0000_i1094" style="width:0;height:1.5pt" o:hralign="center" o:hrstd="t" o:hr="t" fillcolor="#a0a0a0" stroked="f"/>
-        </w:pict>
-      </w:r>
-    </w:p>
-    <w:p>
-      <w:pPr>
-        <w:rPr>
-          <w:b/>
-          <w:bCs/>
-        </w:rPr>
-      </w:pPr>
-      <w:r>
-        <w:rPr>
-          <w:rFonts w:ascii="Segoe UI Emoji" w:hAnsi="Segoe UI Emoji" w:cs="Segoe UI Emoji"/>
-          <w:b/>
-          <w:bCs/>
-        </w:rPr>
-        <w:t>📊</w:t>
-      </w:r>
-      <w:r>
-        <w:rPr>
-          <w:b/>
-          <w:bCs/>
-        </w:rPr>
-        <w:t xml:space="preserve"> Running Regression Tests</w:t>
-      </w:r>
-    </w:p>
-    <w:p>
-      <w:pPr>
-        <w:rPr>
-          <w:b/>
-          <w:bCs/>
-        </w:rPr>
-      </w:pPr>
-      <w:r>
-        <w:rPr>
-          <w:b/>
-          <w:bCs/>
-        </w:rPr>
-        <w:t>Run all elements:</w:t>
-      </w:r>
-    </w:p>
-    <w:p>
-      <w:r>
-        <w:t>python run_regression.py --all</w:t>
-      </w:r>
-    </w:p>
-    <w:p>
-      <w:pPr>
-        <w:rPr>
-          <w:b/>
-          <w:bCs/>
-        </w:rPr>
-      </w:pPr>
-      <w:r>
-        <w:rPr>
-          <w:b/>
-          <w:bCs/>
-        </w:rPr>
-        <w:t>Run a specific element:</w:t>
-      </w:r>
-    </w:p>
-    <w:p>
-      <w:r>
-        <w:t>python run_regression.py --element B --mode legacy --input element_B_scores.csv</w:t>
-      </w:r>
-    </w:p>
-    <w:p>
-      <w:r>
-        <w:pict w14:anchorId="2FC906F8">
-          <v:rect id="_x0000_i1095" style="width:0;height:1.5pt" o:hralign="center" o:hrstd="t" o:hr="t" fillcolor="#a0a0a0" stroked="f"/>
-        </w:pict>
-      </w:r>
-    </w:p>
-    <w:p>
-      <w:pPr>
-        <w:rPr>
-          <w:b/>
-          <w:bCs/>
-        </w:rPr>
-      </w:pPr>
-      <w:r>
-        <w:rPr>
-          <w:rFonts w:ascii="Segoe UI Emoji" w:hAnsi="Segoe UI Emoji" w:cs="Segoe UI Emoji"/>
-          <w:b/>
-          <w:bCs/>
-        </w:rPr>
-        <w:t>📁</w:t>
-      </w:r>
-      <w:r>
-        <w:rPr>
-          <w:b/>
-          <w:bCs/>
-        </w:rPr>
-        <w:t xml:space="preserve"> Input Requirements</w:t>
-      </w:r>
-    </w:p>
-    <w:p>
-      <w:r>
-        <w:t>CSV files must include GPT score columns:</w:t>
-      </w:r>
-    </w:p>
-    <w:p>
-      <w:r>
-        <w:t>Example:</w:t>
-      </w:r>
-    </w:p>
-    <w:p>
-      <w:r>
-        <w:t>filename, B1_gpt, B2_gpt</w:t>
-      </w:r>
-    </w:p>
+    </w:p>
+    <w:p>
+      <w:r>
+        <w:t>```</w:t>
+      </w:r>
+    </w:p>
+    <w:p/>
     <w:p>
       <w:r>
         <w:rPr>
           <w:rFonts w:ascii="Segoe UI Emoji" w:hAnsi="Segoe UI Emoji" w:cs="Segoe UI Emoji"/>
         </w:rPr>
-        <w:t>❗</w:t>
-      </w:r>
-      <w:r>
-        <w:t xml:space="preserve"> Do NOT rename columns.</w:t>
-      </w:r>
-    </w:p>
-    <w:p>
-      <w:r>
-        <w:pict w14:anchorId="4E1D232C">
-          <v:rect id="_x0000_i1096" style="width:0;height:1.5pt" o:hralign="center" o:hrstd="t" o:hr="t" fillcolor="#a0a0a0" stroked="f"/>
-        </w:pict>
-      </w:r>
-    </w:p>
-    <w:p>
-      <w:pPr>
-        <w:rPr>
-          <w:b/>
-          <w:bCs/>
-        </w:rPr>
-      </w:pPr>
+        <w:t>👉</w:t>
+      </w:r>
+      <w:r>
+        <w:t xml:space="preserve"> Always work inside **</w:t>
+      </w:r>
+      <w:proofErr w:type="spellStart"/>
+      <w:r>
+        <w:t>GPTScorer_run</w:t>
+      </w:r>
+      <w:proofErr w:type="spellEnd"/>
+      <w:r>
+        <w:t>**</w:t>
+      </w:r>
+    </w:p>
+    <w:p/>
+    <w:p>
+      <w:r>
+        <w:t>---</w:t>
+      </w:r>
+    </w:p>
+    <w:p/>
+    <w:p>
+      <w:r>
+        <w:t>## Step 4 — Set Up the Python Environment</w:t>
+      </w:r>
+    </w:p>
+    <w:p/>
+    <w:p>
+      <w:r>
+        <w:t>In Terminal:</w:t>
+      </w:r>
+    </w:p>
+    <w:p/>
+    <w:p>
+      <w:r>
+        <w:t>```</w:t>
+      </w:r>
+    </w:p>
+    <w:p>
+      <w:r>
+        <w:lastRenderedPageBreak/>
+        <w:t xml:space="preserve">python3 -m </w:t>
+      </w:r>
+      <w:proofErr w:type="spellStart"/>
+      <w:r>
+        <w:t>venv</w:t>
+      </w:r>
+      <w:proofErr w:type="spellEnd"/>
+      <w:r>
+        <w:t xml:space="preserve"> </w:t>
+      </w:r>
+      <w:proofErr w:type="spellStart"/>
+      <w:r>
+        <w:t>venv</w:t>
+      </w:r>
+      <w:proofErr w:type="spellEnd"/>
+    </w:p>
+    <w:p>
+      <w:r>
+        <w:t xml:space="preserve">source </w:t>
+      </w:r>
+      <w:proofErr w:type="spellStart"/>
+      <w:r>
+        <w:t>venv</w:t>
+      </w:r>
+      <w:proofErr w:type="spellEnd"/>
+      <w:r>
+        <w:t>/bin/activate</w:t>
+      </w:r>
+    </w:p>
+    <w:p>
+      <w:r>
+        <w:t>pip install -r requirements.txt</w:t>
+      </w:r>
+    </w:p>
+    <w:p>
+      <w:r>
+        <w:t>```</w:t>
+      </w:r>
+    </w:p>
+    <w:p/>
+    <w:p>
+      <w:r>
+        <w:t>You should now see `(</w:t>
+      </w:r>
+      <w:proofErr w:type="spellStart"/>
+      <w:r>
+        <w:t>venv</w:t>
+      </w:r>
+      <w:proofErr w:type="spellEnd"/>
+      <w:r>
+        <w:t>)` in your terminal.</w:t>
+      </w:r>
+    </w:p>
+    <w:p/>
+    <w:p>
+      <w:r>
+        <w:t>---</w:t>
+      </w:r>
+    </w:p>
+    <w:p/>
+    <w:p>
+      <w:r>
+        <w:t>## Step 5 — Start the Application</w:t>
+      </w:r>
+    </w:p>
+    <w:p/>
+    <w:p>
+      <w:r>
+        <w:t>Run:</w:t>
+      </w:r>
+    </w:p>
+    <w:p/>
+    <w:p>
+      <w:r>
+        <w:t>```</w:t>
+      </w:r>
+    </w:p>
+    <w:p>
+      <w:r>
+        <w:t>python controller_app.py</w:t>
+      </w:r>
+    </w:p>
+    <w:p>
+      <w:r>
+        <w:t>```</w:t>
+      </w:r>
+    </w:p>
+    <w:p/>
+    <w:p>
+      <w:r>
+        <w:t>Then open a browser and go to:</w:t>
+      </w:r>
+    </w:p>
+    <w:p/>
+    <w:p>
       <w:r>
         <w:rPr>
           <w:rFonts w:ascii="Segoe UI Emoji" w:hAnsi="Segoe UI Emoji" w:cs="Segoe UI Emoji"/>
-          <w:b/>
-          <w:bCs/>
+        </w:rPr>
+        <w:t>👉</w:t>
+      </w:r>
+      <w:r>
+        <w:t xml:space="preserve"> http://127.0.0.1:8000</w:t>
+      </w:r>
+    </w:p>
+    <w:p/>
+    <w:p>
+      <w:r>
+        <w:t>You should see the scoring interface.</w:t>
+      </w:r>
+    </w:p>
+    <w:p/>
+    <w:p>
+      <w:r>
+        <w:t>---</w:t>
+      </w:r>
+    </w:p>
+    <w:p/>
+    <w:p>
+      <w:r>
+        <w:t># PART 2 — Daily Use (What You Actually Do)</w:t>
+      </w:r>
+    </w:p>
+    <w:p/>
+    <w:p>
+      <w:r>
+        <w:t>## Step 1 — Open the App</w:t>
+      </w:r>
+    </w:p>
+    <w:p/>
+    <w:p>
+      <w:r>
+        <w:t>1. Open Terminal</w:t>
+      </w:r>
+    </w:p>
+    <w:p>
+      <w:r>
+        <w:t>2. Navigate to your folder</w:t>
+      </w:r>
+    </w:p>
+    <w:p>
+      <w:r>
+        <w:t>3. Activate environment:</w:t>
+      </w:r>
+    </w:p>
+    <w:p/>
+    <w:p>
+      <w:r>
+        <w:t>```</w:t>
+      </w:r>
+    </w:p>
+    <w:p>
+      <w:r>
+        <w:t xml:space="preserve">source </w:t>
+      </w:r>
+      <w:proofErr w:type="spellStart"/>
+      <w:r>
+        <w:t>venv</w:t>
+      </w:r>
+      <w:proofErr w:type="spellEnd"/>
+      <w:r>
+        <w:t>/bin/activate</w:t>
+      </w:r>
+    </w:p>
+    <w:p>
+      <w:r>
+        <w:t>```</w:t>
+      </w:r>
+    </w:p>
+    <w:p/>
+    <w:p>
+      <w:r>
+        <w:t>4. Run:</w:t>
+      </w:r>
+    </w:p>
+    <w:p/>
+    <w:p>
+      <w:r>
+        <w:t>```</w:t>
+      </w:r>
+    </w:p>
+    <w:p>
+      <w:r>
+        <w:t>python controller_app.py</w:t>
+      </w:r>
+    </w:p>
+    <w:p>
+      <w:r>
+        <w:t>```</w:t>
+      </w:r>
+    </w:p>
+    <w:p/>
+    <w:p>
+      <w:r>
+        <w:t>5. Open browser → http://127.0.0.1:8000</w:t>
+      </w:r>
+    </w:p>
+    <w:p/>
+    <w:p>
+      <w:r>
+        <w:t>---</w:t>
+      </w:r>
+    </w:p>
+    <w:p/>
+    <w:p>
+      <w:r>
+        <w:t>## Step 2 — Score Documents</w:t>
+      </w:r>
+    </w:p>
+    <w:p/>
+    <w:p>
+      <w:r>
+        <w:t>1. Select Element (A, B, C, or D)</w:t>
+      </w:r>
+    </w:p>
+    <w:p>
+      <w:r>
+        <w:t>2. Choose mode:</w:t>
+      </w:r>
+    </w:p>
+    <w:p>
+      <w:r>
+        <w:t xml:space="preserve">   - </w:t>
+      </w:r>
+      <w:r>
+        <w:rPr>
+          <w:rFonts w:ascii="Segoe UI Emoji" w:hAnsi="Segoe UI Emoji" w:cs="Segoe UI Emoji"/>
         </w:rPr>
         <w:t>✅</w:t>
       </w:r>
       <w:r>
-        <w:rPr>
-          <w:b/>
-          <w:bCs/>
-        </w:rPr>
-        <w:t xml:space="preserve"> Output Interpretation</w:t>
-      </w:r>
-    </w:p>
-    <w:p>
-      <w:pPr>
-        <w:rPr>
-          <w:b/>
-          <w:bCs/>
-        </w:rPr>
-      </w:pPr>
-      <w:r>
-        <w:rPr>
-          <w:b/>
-          <w:bCs/>
-        </w:rPr>
-        <w:t>PASS</w:t>
-      </w:r>
-    </w:p>
-    <w:p>
-      <w:pPr>
-        <w:numPr>
-          <w:ilvl w:val="0"/>
-          <w:numId w:val="1"/>
-        </w:numPr>
-      </w:pPr>
-      <w:r>
-        <w:t>Model behavior matches baseline</w:t>
-      </w:r>
-    </w:p>
-    <w:p>
-      <w:pPr>
-        <w:numPr>
-          <w:ilvl w:val="0"/>
-          <w:numId w:val="1"/>
-        </w:numPr>
-      </w:pPr>
-      <w:r>
-        <w:t>No action needed</w:t>
-      </w:r>
-    </w:p>
-    <w:p>
-      <w:pPr>
-        <w:rPr>
-          <w:b/>
-          <w:bCs/>
-        </w:rPr>
-      </w:pPr>
-      <w:r>
-        <w:rPr>
-          <w:b/>
-          <w:bCs/>
-        </w:rPr>
-        <w:t>FAIL</w:t>
-      </w:r>
-    </w:p>
-    <w:p>
-      <w:pPr>
-        <w:numPr>
-          <w:ilvl w:val="0"/>
-          <w:numId w:val="2"/>
-        </w:numPr>
-      </w:pPr>
-      <w:r>
-        <w:t>Drift detected</w:t>
-      </w:r>
-    </w:p>
-    <w:p>
-      <w:pPr>
-        <w:numPr>
-          <w:ilvl w:val="0"/>
-          <w:numId w:val="2"/>
-        </w:numPr>
-      </w:pPr>
-      <w:r>
-        <w:t>Re-run once to confirm</w:t>
-      </w:r>
-    </w:p>
-    <w:p>
-      <w:pPr>
-        <w:numPr>
-          <w:ilvl w:val="0"/>
-          <w:numId w:val="2"/>
-        </w:numPr>
-      </w:pPr>
-      <w:r>
-        <w:t>If persistent, escalate</w:t>
-      </w:r>
-    </w:p>
-    <w:p>
-      <w:r>
-        <w:pict w14:anchorId="4EDB28F9">
-          <v:rect id="_x0000_i1097" style="width:0;height:1.5pt" o:hralign="center" o:hrstd="t" o:hr="t" fillcolor="#a0a0a0" stroked="f"/>
-        </w:pict>
-      </w:r>
-    </w:p>
-    <w:p>
-      <w:pPr>
-        <w:rPr>
-          <w:b/>
-          <w:bCs/>
-        </w:rPr>
-      </w:pPr>
+        <w:t xml:space="preserve"> Current (default)</w:t>
+      </w:r>
+    </w:p>
+    <w:p>
+      <w:r>
+        <w:lastRenderedPageBreak/>
+        <w:t xml:space="preserve">   - </w:t>
+      </w:r>
       <w:r>
         <w:rPr>
           <w:rFonts w:ascii="Segoe UI Emoji" w:hAnsi="Segoe UI Emoji" w:cs="Segoe UI Emoji"/>
-          <w:b/>
-          <w:bCs/>
+        </w:rPr>
+        <w:t>⬜</w:t>
+      </w:r>
+      <w:r>
+        <w:t xml:space="preserve"> Legacy (only for older submissions)</w:t>
+      </w:r>
+    </w:p>
+    <w:p>
+      <w:r>
+        <w:t>3. Upload files (Word, PDF, or CSV)</w:t>
+      </w:r>
+    </w:p>
+    <w:p>
+      <w:r>
+        <w:t>4. Click **"Score Documents"**</w:t>
+      </w:r>
+    </w:p>
+    <w:p/>
+    <w:p>
+      <w:r>
+        <w:t>---</w:t>
+      </w:r>
+    </w:p>
+    <w:p/>
+    <w:p>
+      <w:r>
+        <w:t>## Step 3 — View Results</w:t>
+      </w:r>
+    </w:p>
+    <w:p/>
+    <w:p>
+      <w:r>
+        <w:t>You will see:</w:t>
+      </w:r>
+    </w:p>
+    <w:p/>
+    <w:p>
+      <w:r>
+        <w:t xml:space="preserve">- </w:t>
+      </w:r>
+      <w:proofErr w:type="spellStart"/>
+      <w:r>
+        <w:t>Subscores</w:t>
+      </w:r>
+      <w:proofErr w:type="spellEnd"/>
+      <w:r>
+        <w:t xml:space="preserve"> (D1, D2, D3, D4, etc.)</w:t>
+      </w:r>
+    </w:p>
+    <w:p>
+      <w:r>
+        <w:t>- Final calibrated score</w:t>
+      </w:r>
+    </w:p>
+    <w:p>
+      <w:r>
+        <w:t>- Flags (issues detected)</w:t>
+      </w:r>
+    </w:p>
+    <w:p>
+      <w:r>
+        <w:t>- Rationales (why scores were assigned)</w:t>
+      </w:r>
+    </w:p>
+    <w:p/>
+    <w:p>
+      <w:r>
+        <w:t>Optional:</w:t>
+      </w:r>
+    </w:p>
+    <w:p>
+      <w:r>
+        <w:t>- Download results as CSV</w:t>
+      </w:r>
+    </w:p>
+    <w:p/>
+    <w:p>
+      <w:r>
+        <w:t>---</w:t>
+      </w:r>
+    </w:p>
+    <w:p/>
+    <w:p>
+      <w:r>
+        <w:t># PART 3 — Diagnostics (Important but Simple Rules)</w:t>
+      </w:r>
+    </w:p>
+    <w:p/>
+    <w:p>
+      <w:r>
+        <w:t>There is an **Admin Diagnostics panel** in the UI.</w:t>
+      </w:r>
+    </w:p>
+    <w:p/>
+    <w:p>
+      <w:r>
+        <w:t>## What You Should Do</w:t>
+      </w:r>
+    </w:p>
+    <w:p/>
+    <w:p>
+      <w:r>
+        <w:lastRenderedPageBreak/>
+        <w:t>After scoring:</w:t>
+      </w:r>
+    </w:p>
+    <w:p/>
+    <w:p>
+      <w:r>
+        <w:t>1. Expand "Admin Diagnostics"</w:t>
+      </w:r>
+    </w:p>
+    <w:p>
+      <w:r>
+        <w:t>2. Click **"Check Saved Results"**</w:t>
+      </w:r>
+    </w:p>
+    <w:p/>
+    <w:p>
+      <w:r>
+        <w:t>---</w:t>
+      </w:r>
+    </w:p>
+    <w:p/>
+    <w:p>
+      <w:r>
+        <w:t>## What the System Checks Automatically</w:t>
+      </w:r>
+    </w:p>
+    <w:p/>
+    <w:p>
+      <w:r>
+        <w:t>### 1. Drift Detection</w:t>
+      </w:r>
+    </w:p>
+    <w:p>
+      <w:r>
+        <w:t>Checks if scoring behavior has changed unexpectedly.</w:t>
+      </w:r>
+    </w:p>
+    <w:p/>
+    <w:p>
+      <w:r>
+        <w:t>### 2. Regression Testing</w:t>
+      </w:r>
+    </w:p>
+    <w:p>
+      <w:proofErr w:type="gramStart"/>
+      <w:r>
+        <w:t>Compares</w:t>
+      </w:r>
+      <w:proofErr w:type="gramEnd"/>
+      <w:r>
+        <w:t xml:space="preserve"> results to a known "golden" dataset.</w:t>
+      </w:r>
+    </w:p>
+    <w:p/>
+    <w:p>
+      <w:r>
+        <w:t>---</w:t>
+      </w:r>
+    </w:p>
+    <w:p/>
+    <w:p>
+      <w:r>
+        <w:t>## How to Interpret Results</w:t>
+      </w:r>
+    </w:p>
+    <w:p/>
+    <w:p>
+      <w:r>
+        <w:t xml:space="preserve">### </w:t>
+      </w:r>
+      <w:r>
+        <w:rPr>
+          <w:rFonts w:ascii="Segoe UI Emoji" w:hAnsi="Segoe UI Emoji" w:cs="Segoe UI Emoji"/>
+        </w:rPr>
+        <w:t>✅</w:t>
+      </w:r>
+      <w:r>
+        <w:t xml:space="preserve"> PASS</w:t>
+      </w:r>
+    </w:p>
+    <w:p>
+      <w:r>
+        <w:t>- Everything is working correctly</w:t>
+      </w:r>
+    </w:p>
+    <w:p>
+      <w:r>
+        <w:t>- No action needed</w:t>
+      </w:r>
+    </w:p>
+    <w:p/>
+    <w:p>
+      <w:r>
+        <w:t xml:space="preserve">### </w:t>
+      </w:r>
+      <w:r>
+        <w:rPr>
+          <w:rFonts w:ascii="Segoe UI Emoji" w:hAnsi="Segoe UI Emoji" w:cs="Segoe UI Emoji"/>
+        </w:rPr>
+        <w:t>❌</w:t>
+      </w:r>
+      <w:r>
+        <w:t xml:space="preserve"> FAIL</w:t>
+      </w:r>
+    </w:p>
+    <w:p>
+      <w:r>
+        <w:t>- Something changed in scoring behavior</w:t>
+      </w:r>
+    </w:p>
+    <w:p/>
+    <w:p>
+      <w:r>
+        <w:lastRenderedPageBreak/>
+        <w:t>Do this:</w:t>
+      </w:r>
+    </w:p>
+    <w:p>
+      <w:r>
+        <w:t>1. Re-run scoring once</w:t>
+      </w:r>
+    </w:p>
+    <w:p>
+      <w:r>
+        <w:t>2. If still FAIL → notify supervisor</w:t>
+      </w:r>
+    </w:p>
+    <w:p/>
+    <w:p>
+      <w:r>
+        <w:t>---</w:t>
+      </w:r>
+    </w:p>
+    <w:p/>
+    <w:p>
+      <w:r>
+        <w:t xml:space="preserve"># PART 4 — What NOT </w:t>
+      </w:r>
+      <w:proofErr w:type="gramStart"/>
+      <w:r>
+        <w:t>to Touch</w:t>
+      </w:r>
+      <w:proofErr w:type="gramEnd"/>
+    </w:p>
+    <w:p/>
+    <w:p>
+      <w:r>
+        <w:rPr>
+          <w:rFonts w:ascii="Segoe UI Emoji" w:hAnsi="Segoe UI Emoji" w:cs="Segoe UI Emoji"/>
         </w:rPr>
         <w:t>⚠️</w:t>
       </w:r>
       <w:r>
-        <w:rPr>
-          <w:b/>
-          <w:bCs/>
-        </w:rPr>
-        <w:t xml:space="preserve"> Common Issues</w:t>
-      </w:r>
-    </w:p>
-    <w:p>
-      <w:pPr>
-        <w:rPr>
-          <w:b/>
-          <w:bCs/>
-        </w:rPr>
-      </w:pPr>
-      <w:r>
-        <w:rPr>
-          <w:b/>
-          <w:bCs/>
-        </w:rPr>
-        <w:lastRenderedPageBreak/>
-        <w:t>All scores are zero</w:t>
-      </w:r>
-    </w:p>
-    <w:p>
-      <w:pPr>
-        <w:numPr>
-          <w:ilvl w:val="0"/>
-          <w:numId w:val="3"/>
-        </w:numPr>
-      </w:pPr>
-      <w:r>
-        <w:t>Wrong CSV file</w:t>
-      </w:r>
-    </w:p>
-    <w:p>
-      <w:pPr>
-        <w:numPr>
-          <w:ilvl w:val="0"/>
-          <w:numId w:val="3"/>
-        </w:numPr>
-      </w:pPr>
-      <w:r>
-        <w:t>Missing *_</w:t>
-      </w:r>
-      <w:proofErr w:type="spellStart"/>
-      <w:r>
-        <w:t>gpt</w:t>
-      </w:r>
-      <w:proofErr w:type="spellEnd"/>
-      <w:r>
-        <w:t xml:space="preserve"> columns</w:t>
-      </w:r>
-    </w:p>
-    <w:p>
-      <w:pPr>
-        <w:rPr>
-          <w:b/>
-          <w:bCs/>
-        </w:rPr>
-      </w:pPr>
-      <w:r>
-        <w:rPr>
-          <w:b/>
-          <w:bCs/>
-        </w:rPr>
-        <w:t>OCR errors</w:t>
-      </w:r>
-    </w:p>
-    <w:p>
-      <w:pPr>
-        <w:numPr>
-          <w:ilvl w:val="0"/>
-          <w:numId w:val="4"/>
-        </w:numPr>
-      </w:pPr>
-      <w:r>
-        <w:t>Ensure Tesseract is installed</w:t>
-      </w:r>
-    </w:p>
-    <w:p>
-      <w:pPr>
-        <w:rPr>
-          <w:b/>
-          <w:bCs/>
-        </w:rPr>
-      </w:pPr>
-      <w:r>
-        <w:rPr>
-          <w:b/>
-          <w:bCs/>
-        </w:rPr>
-        <w:t>Drift detected unexpectedly</w:t>
-      </w:r>
-    </w:p>
-    <w:p>
-      <w:pPr>
-        <w:numPr>
-          <w:ilvl w:val="0"/>
-          <w:numId w:val="5"/>
-        </w:numPr>
-      </w:pPr>
-      <w:r>
-        <w:t>Confirm correct element and mode</w:t>
-      </w:r>
-    </w:p>
-    <w:p>
-      <w:pPr>
-        <w:numPr>
-          <w:ilvl w:val="0"/>
-          <w:numId w:val="5"/>
-        </w:numPr>
-      </w:pPr>
-      <w:r>
-        <w:t>Check input file</w:t>
-      </w:r>
-    </w:p>
-    <w:p>
-      <w:r>
-        <w:pict w14:anchorId="48BFB811">
-          <v:rect id="_x0000_i1098" style="width:0;height:1.5pt" o:hralign="center" o:hrstd="t" o:hr="t" fillcolor="#a0a0a0" stroked="f"/>
-        </w:pict>
-      </w:r>
-    </w:p>
-    <w:p>
-      <w:pPr>
-        <w:rPr>
-          <w:b/>
-          <w:bCs/>
-        </w:rPr>
-      </w:pPr>
+        <w:t xml:space="preserve"> Do NOT change:</w:t>
+      </w:r>
+    </w:p>
+    <w:p/>
+    <w:p>
+      <w:r>
+        <w:t>- config/ files (baseline metrics)</w:t>
+      </w:r>
+    </w:p>
+    <w:p>
+      <w:r>
+        <w:t>- elements/ code</w:t>
+      </w:r>
+    </w:p>
+    <w:p>
+      <w:r>
+        <w:t>- golden datasets</w:t>
+      </w:r>
+    </w:p>
+    <w:p/>
+    <w:p>
       <w:r>
         <w:rPr>
           <w:rFonts w:ascii="Segoe UI Emoji" w:hAnsi="Segoe UI Emoji" w:cs="Segoe UI Emoji"/>
-          <w:b/>
-          <w:bCs/>
         </w:rPr>
-        <w:t>🧠</w:t>
-      </w:r>
-      <w:r>
-        <w:rPr>
-          <w:b/>
-          <w:bCs/>
-        </w:rPr>
-        <w:t xml:space="preserve"> Expected Behavior</w:t>
-      </w:r>
-    </w:p>
-    <w:p>
-      <w:pPr>
-        <w:numPr>
-          <w:ilvl w:val="0"/>
-          <w:numId w:val="6"/>
-        </w:numPr>
-      </w:pPr>
-      <w:r>
-        <w:t>Mean final ≠ mean raw (slightly)</w:t>
-      </w:r>
-    </w:p>
-    <w:p>
-      <w:pPr>
-        <w:numPr>
-          <w:ilvl w:val="0"/>
-          <w:numId w:val="6"/>
-        </w:numPr>
-      </w:pPr>
-      <w:r>
-        <w:t>~60–90 rows adjusted during calibration</w:t>
-      </w:r>
-    </w:p>
-    <w:p>
-      <w:pPr>
-        <w:numPr>
-          <w:ilvl w:val="0"/>
-          <w:numId w:val="6"/>
-        </w:numPr>
-      </w:pPr>
-      <w:r>
-        <w:t>Small drift is normal</w:t>
-      </w:r>
-    </w:p>
-    <w:p>
-      <w:r>
-        <w:pict w14:anchorId="7E053552">
-          <v:rect id="_x0000_i1099" style="width:0;height:1.5pt" o:hralign="center" o:hrstd="t" o:hr="t" fillcolor="#a0a0a0" stroked="f"/>
-        </w:pict>
-      </w:r>
-    </w:p>
-    <w:p>
-      <w:pPr>
-        <w:rPr>
-          <w:b/>
-          <w:bCs/>
-        </w:rPr>
-      </w:pPr>
+        <w:t>⚠️</w:t>
+      </w:r>
+      <w:r>
+        <w:t xml:space="preserve"> Do NOT enable these unless instructed:</w:t>
+      </w:r>
+    </w:p>
+    <w:p/>
+    <w:p>
+      <w:r>
+        <w:t>- Rebuild drift baseline</w:t>
+      </w:r>
+    </w:p>
+    <w:p>
+      <w:r>
+        <w:t>- Rebuild regression baseline</w:t>
+      </w:r>
+    </w:p>
+    <w:p>
+      <w:r>
+        <w:t>- Recompute regression scores</w:t>
+      </w:r>
+    </w:p>
+    <w:p/>
+    <w:p>
+      <w:r>
+        <w:t>---</w:t>
+      </w:r>
+    </w:p>
+    <w:p/>
+    <w:p>
+      <w:r>
+        <w:t># PART 5 — Common Issues (Easy Fixes)</w:t>
+      </w:r>
+    </w:p>
+    <w:p/>
+    <w:p>
+      <w:r>
+        <w:t>## Problem: Page doesn’t load</w:t>
+      </w:r>
+    </w:p>
+    <w:p>
+      <w:r>
+        <w:t>- Make sure server is running</w:t>
+      </w:r>
+    </w:p>
+    <w:p>
+      <w:r>
+        <w:lastRenderedPageBreak/>
+        <w:t>- Check: http://127.0.0.1:8000</w:t>
+      </w:r>
+    </w:p>
+    <w:p/>
+    <w:p>
+      <w:r>
+        <w:t>## Problem: All scores are zero</w:t>
+      </w:r>
+    </w:p>
+    <w:p>
+      <w:r>
+        <w:t>- Wrong file format</w:t>
+      </w:r>
+    </w:p>
+    <w:p>
+      <w:r>
+        <w:t>- Try a different document</w:t>
+      </w:r>
+    </w:p>
+    <w:p/>
+    <w:p>
+      <w:r>
+        <w:t>## Problem: OCR issues</w:t>
+      </w:r>
+    </w:p>
+    <w:p>
+      <w:r>
+        <w:t>- Reinstall tesseract:</w:t>
+      </w:r>
+    </w:p>
+    <w:p/>
+    <w:p>
+      <w:r>
+        <w:t>```</w:t>
+      </w:r>
+    </w:p>
+    <w:p>
+      <w:r>
+        <w:t>brew install tesseract</w:t>
+      </w:r>
+    </w:p>
+    <w:p>
+      <w:r>
+        <w:t>```</w:t>
+      </w:r>
+    </w:p>
+    <w:p/>
+    <w:p>
+      <w:r>
+        <w:t>## Problem: Command not found</w:t>
+      </w:r>
+    </w:p>
+    <w:p>
+      <w:r>
+        <w:t>- Python not installed correctly</w:t>
+      </w:r>
+    </w:p>
+    <w:p>
+      <w:r>
+        <w:t>- Try `python3` instead of `python`</w:t>
+      </w:r>
+    </w:p>
+    <w:p/>
+    <w:p>
+      <w:r>
+        <w:t>---</w:t>
+      </w:r>
+    </w:p>
+    <w:p/>
+    <w:p>
+      <w:r>
+        <w:t xml:space="preserve"># PART 6 — What Changed </w:t>
+      </w:r>
+      <w:proofErr w:type="gramStart"/>
+      <w:r>
+        <w:t>From</w:t>
+      </w:r>
+      <w:proofErr w:type="gramEnd"/>
+      <w:r>
+        <w:t xml:space="preserve"> the Old Guide</w:t>
+      </w:r>
+    </w:p>
+    <w:p/>
+    <w:p>
+      <w:r>
+        <w:t>Previously:</w:t>
+      </w:r>
+    </w:p>
+    <w:p>
+      <w:r>
+        <w:t>- Command-line only</w:t>
+      </w:r>
+    </w:p>
+    <w:p>
+      <w:r>
+        <w:t>- Manual regression scripts</w:t>
+      </w:r>
+    </w:p>
+    <w:p/>
+    <w:p>
+      <w:r>
+        <w:t>Now:</w:t>
+      </w:r>
+    </w:p>
+    <w:p>
+      <w:r>
+        <w:lastRenderedPageBreak/>
+        <w:t xml:space="preserve">- </w:t>
+      </w:r>
       <w:r>
         <w:rPr>
           <w:rFonts w:ascii="Segoe UI Emoji" w:hAnsi="Segoe UI Emoji" w:cs="Segoe UI Emoji"/>
-          <w:b/>
-          <w:bCs/>
         </w:rPr>
-        <w:t>🔒</w:t>
-      </w:r>
-      <w:r>
-        <w:rPr>
-          <w:b/>
-          <w:bCs/>
-        </w:rPr>
-        <w:t xml:space="preserve"> Important Notes</w:t>
-      </w:r>
-    </w:p>
-    <w:p>
-      <w:pPr>
-        <w:numPr>
-          <w:ilvl w:val="0"/>
-          <w:numId w:val="7"/>
-        </w:numPr>
-      </w:pPr>
-      <w:r>
-        <w:t>Do NOT modify baseline JSON files</w:t>
-      </w:r>
-    </w:p>
-    <w:p>
-      <w:pPr>
-        <w:numPr>
-          <w:ilvl w:val="0"/>
-          <w:numId w:val="7"/>
-        </w:numPr>
-      </w:pPr>
-      <w:r>
-        <w:t>Do NOT edit code in the main repo</w:t>
-      </w:r>
-    </w:p>
-    <w:p>
-      <w:pPr>
-        <w:numPr>
-          <w:ilvl w:val="0"/>
-          <w:numId w:val="7"/>
-        </w:numPr>
-      </w:pPr>
-      <w:r>
-        <w:t>Always use provided CSV templates</w:t>
-      </w:r>
-    </w:p>
-    <w:p>
-      <w:r>
-        <w:pict w14:anchorId="28DB8021">
-          <v:rect id="_x0000_i1100" style="width:0;height:1.5pt" o:hralign="center" o:hrstd="t" o:hr="t" fillcolor="#a0a0a0" stroked="f"/>
-        </w:pict>
-      </w:r>
-    </w:p>
-    <w:p>
-      <w:pPr>
-        <w:rPr>
-          <w:b/>
-          <w:bCs/>
-        </w:rPr>
-      </w:pPr>
+        <w:t>✅</w:t>
+      </w:r>
+      <w:r>
+        <w:t xml:space="preserve"> Web interface (primary workflow)</w:t>
+      </w:r>
+    </w:p>
+    <w:p>
+      <w:r>
+        <w:t xml:space="preserve">- </w:t>
+      </w:r>
       <w:r>
         <w:rPr>
           <w:rFonts w:ascii="Segoe UI Emoji" w:hAnsi="Segoe UI Emoji" w:cs="Segoe UI Emoji"/>
-          <w:b/>
-          <w:bCs/>
         </w:rPr>
-        <w:t>🆘</w:t>
+        <w:t>✅</w:t>
+      </w:r>
+      <w:r>
+        <w:t xml:space="preserve"> Automatic calibration pipeline</w:t>
+      </w:r>
+    </w:p>
+    <w:p>
+      <w:r>
+        <w:t xml:space="preserve">- </w:t>
       </w:r>
       <w:r>
         <w:rPr>
-          <w:b/>
-          <w:bCs/>
+          <w:rFonts w:ascii="Segoe UI Emoji" w:hAnsi="Segoe UI Emoji" w:cs="Segoe UI Emoji"/>
         </w:rPr>
-        <w:t xml:space="preserve"> If Something Breaks</w:t>
-      </w:r>
-    </w:p>
-    <w:p>
-      <w:pPr>
-        <w:numPr>
-          <w:ilvl w:val="0"/>
-          <w:numId w:val="8"/>
-        </w:numPr>
-      </w:pPr>
-      <w:r>
-        <w:t>Re-run test</w:t>
-      </w:r>
-    </w:p>
-    <w:p>
-      <w:pPr>
-        <w:numPr>
-          <w:ilvl w:val="0"/>
-          <w:numId w:val="8"/>
-        </w:numPr>
-      </w:pPr>
-      <w:r>
-        <w:t>Check input file</w:t>
-      </w:r>
-    </w:p>
-    <w:p>
-      <w:pPr>
-        <w:numPr>
-          <w:ilvl w:val="0"/>
-          <w:numId w:val="8"/>
-        </w:numPr>
-      </w:pPr>
-      <w:r>
-        <w:t>Restart environment</w:t>
-      </w:r>
-    </w:p>
-    <w:p>
-      <w:pPr>
-        <w:numPr>
-          <w:ilvl w:val="0"/>
-          <w:numId w:val="8"/>
-        </w:numPr>
-      </w:pPr>
-      <w:r>
-        <w:t>Contact project owner</w:t>
-      </w:r>
-    </w:p>
-    <w:p>
-      <w:r>
-        <w:pict w14:anchorId="07CF36DA">
-          <v:rect id="_x0000_i1101" style="width:0;height:1.5pt" o:hralign="center" o:hrstd="t" o:hr="t" fillcolor="#a0a0a0" stroked="f"/>
-        </w:pict>
+        <w:t>✅</w:t>
+      </w:r>
+      <w:r>
+        <w:t xml:space="preserve"> Built-in drift detection</w:t>
+      </w:r>
+    </w:p>
+    <w:p>
+      <w:r>
+        <w:t xml:space="preserve">- </w:t>
+      </w:r>
+      <w:r>
+        <w:rPr>
+          <w:rFonts w:ascii="Segoe UI Emoji" w:hAnsi="Segoe UI Emoji" w:cs="Segoe UI Emoji"/>
+        </w:rPr>
+        <w:t>✅</w:t>
+      </w:r>
+      <w:r>
+        <w:t xml:space="preserve"> Built-in regression testing</w:t>
+      </w:r>
+    </w:p>
+    <w:p>
+      <w:r>
+        <w:t xml:space="preserve">- </w:t>
+      </w:r>
+      <w:r>
+        <w:rPr>
+          <w:rFonts w:ascii="Segoe UI Emoji" w:hAnsi="Segoe UI Emoji" w:cs="Segoe UI Emoji"/>
+        </w:rPr>
+        <w:t>✅</w:t>
+      </w:r>
+      <w:r>
+        <w:t xml:space="preserve"> No need to run scripts manually</w:t>
+      </w:r>
+    </w:p>
+    <w:p/>
+    <w:p>
+      <w:r>
+        <w:t>---</w:t>
+      </w:r>
+    </w:p>
+    <w:p/>
+    <w:p>
+      <w:r>
+        <w:t># PART 7 — Mental Model (Keep It Simple)</w:t>
+      </w:r>
+    </w:p>
+    <w:p/>
+    <w:p>
+      <w:r>
+        <w:t>Think of the system as:</w:t>
+      </w:r>
+    </w:p>
+    <w:p/>
+    <w:p>
+      <w:r>
+        <w:t>1. **Score documents**</w:t>
+      </w:r>
+    </w:p>
+    <w:p>
+      <w:r>
+        <w:t>2. **System adjusts scores (calibration)**</w:t>
+      </w:r>
+    </w:p>
+    <w:p>
+      <w:r>
+        <w:t>3. **System checks itself (diagnostics)**</w:t>
+      </w:r>
+    </w:p>
+    <w:p>
+      <w:r>
+        <w:t>4. **You verify PASS/FAIL**</w:t>
+      </w:r>
+    </w:p>
+    <w:p/>
+    <w:p>
+      <w:r>
+        <w:t>That’s it.</w:t>
+      </w:r>
+    </w:p>
+    <w:p/>
+    <w:p>
+      <w:r>
+        <w:t>---</w:t>
+      </w:r>
+    </w:p>
+    <w:p/>
+    <w:p>
+      <w:r>
+        <w:t># PART 8 — When to Ask for Help</w:t>
+      </w:r>
+    </w:p>
+    <w:p/>
+    <w:p>
+      <w:r>
+        <w:t>Ask your supervisor if:</w:t>
+      </w:r>
+    </w:p>
+    <w:p/>
+    <w:p>
+      <w:r>
+        <w:lastRenderedPageBreak/>
+        <w:t>- You see repeated FAIL results</w:t>
+      </w:r>
+    </w:p>
+    <w:p>
+      <w:r>
+        <w:t>- The app won’t start</w:t>
+      </w:r>
+    </w:p>
+    <w:p>
+      <w:r>
+        <w:t>- Files won’t upload</w:t>
+      </w:r>
+    </w:p>
+    <w:p>
+      <w:r>
+        <w:t>- Results look obviously incorrect</w:t>
+      </w:r>
+    </w:p>
+    <w:p/>
+    <w:p>
+      <w:r>
+        <w:t>---</w:t>
+      </w:r>
+    </w:p>
+    <w:p/>
+    <w:p>
+      <w:r>
+        <w:t># Quick Start Checklist</w:t>
+      </w:r>
+    </w:p>
+    <w:p/>
+    <w:p>
+      <w:r>
+        <w:rPr>
+          <w:rFonts w:ascii="Segoe UI Symbol" w:hAnsi="Segoe UI Symbol" w:cs="Segoe UI Symbol"/>
+        </w:rPr>
+        <w:t>✔</w:t>
+      </w:r>
+      <w:r>
+        <w:t xml:space="preserve"> Install Python</w:t>
+      </w:r>
+    </w:p>
+    <w:p>
+      <w:r>
+        <w:rPr>
+          <w:rFonts w:ascii="Segoe UI Symbol" w:hAnsi="Segoe UI Symbol" w:cs="Segoe UI Symbol"/>
+        </w:rPr>
+        <w:t>✔</w:t>
+      </w:r>
+      <w:r>
+        <w:t xml:space="preserve"> Install Tesseract</w:t>
+      </w:r>
+    </w:p>
+    <w:p>
+      <w:r>
+        <w:rPr>
+          <w:rFonts w:ascii="Segoe UI Symbol" w:hAnsi="Segoe UI Symbol" w:cs="Segoe UI Symbol"/>
+        </w:rPr>
+        <w:t>✔</w:t>
+      </w:r>
+      <w:r>
+        <w:t xml:space="preserve"> Set up environment</w:t>
+      </w:r>
+    </w:p>
+    <w:p>
+      <w:r>
+        <w:rPr>
+          <w:rFonts w:ascii="Segoe UI Symbol" w:hAnsi="Segoe UI Symbol" w:cs="Segoe UI Symbol"/>
+        </w:rPr>
+        <w:t>✔</w:t>
+      </w:r>
+      <w:r>
+        <w:t xml:space="preserve"> Run controller_app.py</w:t>
+      </w:r>
+    </w:p>
+    <w:p>
+      <w:r>
+        <w:rPr>
+          <w:rFonts w:ascii="Segoe UI Symbol" w:hAnsi="Segoe UI Symbol" w:cs="Segoe UI Symbol"/>
+        </w:rPr>
+        <w:t>✔</w:t>
+      </w:r>
+      <w:r>
+        <w:t xml:space="preserve"> Open browser</w:t>
+      </w:r>
+    </w:p>
+    <w:p>
+      <w:r>
+        <w:rPr>
+          <w:rFonts w:ascii="Segoe UI Symbol" w:hAnsi="Segoe UI Symbol" w:cs="Segoe UI Symbol"/>
+        </w:rPr>
+        <w:t>✔</w:t>
+      </w:r>
+      <w:r>
+        <w:t xml:space="preserve"> Upload file</w:t>
+      </w:r>
+    </w:p>
+    <w:p>
+      <w:r>
+        <w:rPr>
+          <w:rFonts w:ascii="Segoe UI Symbol" w:hAnsi="Segoe UI Symbol" w:cs="Segoe UI Symbol"/>
+        </w:rPr>
+        <w:t>✔</w:t>
+      </w:r>
+      <w:r>
+        <w:t xml:space="preserve"> Click Score</w:t>
+      </w:r>
+    </w:p>
+    <w:p>
+      <w:r>
+        <w:rPr>
+          <w:rFonts w:ascii="Segoe UI Symbol" w:hAnsi="Segoe UI Symbol" w:cs="Segoe UI Symbol"/>
+        </w:rPr>
+        <w:t>✔</w:t>
+      </w:r>
+      <w:r>
+        <w:t xml:space="preserve"> Click Check Saved Results</w:t>
+      </w:r>
+    </w:p>
+    <w:p>
+      <w:r>
+        <w:rPr>
+          <w:rFonts w:ascii="Segoe UI Symbol" w:hAnsi="Segoe UI Symbol" w:cs="Segoe UI Symbol"/>
+        </w:rPr>
+        <w:t>✔</w:t>
+      </w:r>
+      <w:r>
+        <w:t xml:space="preserve"> Confirm PASS</w:t>
+      </w:r>
+    </w:p>
+    <w:p/>
+    <w:p>
+      <w:r>
+        <w:t>---</w:t>
+      </w:r>
+    </w:p>
+    <w:p/>
+    <w:p>
+      <w:r>
+        <w:t xml:space="preserve">You are ready to use </w:t>
+      </w:r>
+      <w:proofErr w:type="spellStart"/>
+      <w:r>
+        <w:t>GPTScorer</w:t>
+      </w:r>
+      <w:proofErr w:type="spellEnd"/>
+      <w:r>
+        <w:t xml:space="preserve"> </w:t>
+      </w:r>
+      <w:r>
+        <w:rPr>
+          <w:rFonts w:ascii="Segoe UI Emoji" w:hAnsi="Segoe UI Emoji" w:cs="Segoe UI Emoji"/>
+        </w:rPr>
+        <w:t>🎯</w:t>
       </w:r>
     </w:p>
     <w:p/>
@@ -2752,6 +3183,7 @@
   <w:style w:type="character" w:default="1" w:styleId="DefaultParagraphFont">
     <w:name w:val="Default Paragraph Font"/>
     <w:uiPriority w:val="1"/>
+    <w:semiHidden/>
     <w:unhideWhenUsed/>
   </w:style>
   <w:style w:type="table" w:default="1" w:styleId="TableNormal">

</xml_diff>